<commit_message>
adding more fixes plus a pdf workflow for mac
</commit_message>
<xml_diff>
--- a/2019 Giving Receipts.docx
+++ b/2019 Giving Receipts.docx
@@ -76,7 +76,7 @@
         <w:t>during 201</w:t>
       </w:r>
       <w:r>
-        <w:t>8</w:t>
+        <w:t>9</w:t>
       </w:r>
       <w:r>
         <w:t xml:space="preserve">.  </w:t>
@@ -610,28 +610,38 @@
       </w:rPr>
       <w:t>COLUMBIA</w:t>
     </w:r>
+    <w:r>
+      <w:rPr>
+        <w:rFonts w:ascii="Times New Roman" w:hAnsi="Times New Roman"/>
+        <w:color w:val="282828"/>
+        <w:spacing w:val="16"/>
+        <w:sz w:val="18"/>
+        <w:szCs w:val="18"/>
+      </w:rPr>
+      <w:t xml:space="preserve">, MD </w:t>
+    </w:r>
+    <w:r>
+      <w:rPr>
+        <w:rFonts w:ascii="Times New Roman" w:hAnsi="Times New Roman"/>
+        <w:color w:val="282828"/>
+        <w:spacing w:val="16"/>
+        <w:sz w:val="18"/>
+        <w:szCs w:val="18"/>
+      </w:rPr>
+      <w:t>2104</w:t>
+    </w:r>
+    <w:r>
+      <w:rPr>
+        <w:rFonts w:ascii="Times New Roman" w:hAnsi="Times New Roman"/>
+        <w:color w:val="282828"/>
+        <w:spacing w:val="16"/>
+        <w:sz w:val="18"/>
+        <w:szCs w:val="18"/>
+      </w:rPr>
+      <w:t>5</w:t>
+    </w:r>
     <w:bookmarkStart w:id="0" w:name="_GoBack"/>
     <w:bookmarkEnd w:id="0"/>
-    <w:r>
-      <w:rPr>
-        <w:rFonts w:ascii="Times New Roman" w:hAnsi="Times New Roman"/>
-        <w:color w:val="282828"/>
-        <w:spacing w:val="16"/>
-        <w:sz w:val="18"/>
-        <w:szCs w:val="18"/>
-      </w:rPr>
-      <w:t xml:space="preserve">, MD </w:t>
-    </w:r>
-    <w:r>
-      <w:rPr>
-        <w:rFonts w:ascii="Times New Roman" w:hAnsi="Times New Roman"/>
-        <w:color w:val="282828"/>
-        <w:spacing w:val="16"/>
-        <w:sz w:val="18"/>
-        <w:szCs w:val="18"/>
-      </w:rPr>
-      <w:t>21044</w:t>
-    </w:r>
     <w:r>
       <w:rPr>
         <w:rFonts w:ascii="Times New Roman" w:hAnsi="Times New Roman"/>
@@ -1647,7 +1657,7 @@
 </file>
 
 <file path=customXml/itemProps1.xml><?xml version="1.0" encoding="utf-8"?>
-<ds:datastoreItem xmlns:ds="http://schemas.openxmlformats.org/officeDocument/2006/customXml" ds:itemID="{D468B493-0EFA-8548-94C7-6331963BB9D7}">
+<ds:datastoreItem xmlns:ds="http://schemas.openxmlformats.org/officeDocument/2006/customXml" ds:itemID="{DDEDA5D5-BE8C-644B-A8CF-89C758BF8664}">
   <ds:schemaRefs>
     <ds:schemaRef ds:uri="http://schemas.openxmlformats.org/officeDocument/2006/bibliography"/>
   </ds:schemaRefs>

</xml_diff>